<commit_message>
Minor edits to notebook and linkedin copy.
</commit_message>
<xml_diff>
--- a/TIDYTUESDAY/2025-08-19-SCOTTISH.MUNROS/misc/linkedin_post_copy.docx
+++ b/TIDYTUESDAY/2025-08-19-SCOTTISH.MUNROS/misc/linkedin_post_copy.docx
@@ -12,39 +12,26 @@
       <w:bookmarkStart w:id="0" w:name="_Hlk203144636"/>
       <w:bookmarkStart w:id="1" w:name="_Hlk204099680"/>
       <w:bookmarkStart w:id="2" w:name="_Hlk206018220"/>
-      <w:r>
-        <w:rPr>
-          <w:rFonts w:ascii="Aptos" w:hAnsi="Aptos" w:cs="Apple Color Emoji"/>
-        </w:rPr>
-        <w:t xml:space="preserve">My first ever </w:t>
+      <w:bookmarkStart w:id="3" w:name="_Hlk207634947"/>
+      <w:r>
+        <w:rPr>
+          <w:rFonts w:ascii="Aptos" w:hAnsi="Aptos" w:cs="Apple Color Emoji"/>
+        </w:rPr>
+        <w:t xml:space="preserve">Back from Spain and catching up on </w:t>
       </w:r>
       <w:proofErr w:type="spellStart"/>
       <w:r>
         <w:rPr>
           <w:rFonts w:ascii="Aptos" w:hAnsi="Aptos" w:cs="Apple Color Emoji"/>
         </w:rPr>
-        <w:t>Pydy</w:t>
+        <w:t>PyDy</w:t>
       </w:r>
       <w:proofErr w:type="spellEnd"/>
       <w:r>
         <w:rPr>
           <w:rFonts w:ascii="Aptos" w:hAnsi="Aptos" w:cs="Apple Color Emoji"/>
         </w:rPr>
-        <w:t xml:space="preserve"> Tuesday! Our fall semester is going to be Python-</w:t>
-      </w:r>
-      <w:proofErr w:type="gramStart"/>
-      <w:r>
-        <w:rPr>
-          <w:rFonts w:ascii="Aptos" w:hAnsi="Aptos" w:cs="Apple Color Emoji"/>
-        </w:rPr>
-        <w:t>heavy</w:t>
-      </w:r>
-      <w:proofErr w:type="gramEnd"/>
-      <w:r>
-        <w:rPr>
-          <w:rFonts w:ascii="Aptos" w:hAnsi="Aptos" w:cs="Apple Color Emoji"/>
-        </w:rPr>
-        <w:t xml:space="preserve"> so this is a good time to make the switch.</w:t>
+        <w:t xml:space="preserve"> Tuesday from last week!</w:t>
       </w:r>
     </w:p>
     <w:p>
@@ -66,21 +53,7 @@
         <w:rPr>
           <w:rFonts w:ascii="Aptos" w:hAnsi="Aptos" w:cs="Apple Color Emoji"/>
         </w:rPr>
-        <w:t xml:space="preserve">This week we looked at a dataset about extreme weather events. I'm keeping it simple by doing a heatmap-style table using the great tables package. I love a beautiful table and I'm </w:t>
-      </w:r>
-      <w:proofErr w:type="gramStart"/>
-      <w:r>
-        <w:rPr>
-          <w:rFonts w:ascii="Aptos" w:hAnsi="Aptos" w:cs="Apple Color Emoji"/>
-        </w:rPr>
-        <w:t>definitely going</w:t>
-      </w:r>
-      <w:proofErr w:type="gramEnd"/>
-      <w:r>
-        <w:rPr>
-          <w:rFonts w:ascii="Aptos" w:hAnsi="Aptos" w:cs="Apple Color Emoji"/>
-        </w:rPr>
-        <w:t xml:space="preserve"> to make more of these.</w:t>
+        <w:t>A Munro is a mountain in Scotland with an elevation over 3,000 feet.</w:t>
       </w:r>
     </w:p>
     <w:p>
@@ -102,7 +75,7 @@
         <w:rPr>
           <w:rFonts w:ascii="Aptos" w:hAnsi="Aptos" w:cs="Apple Color Emoji"/>
         </w:rPr>
-        <w:t>Heat and flooding were unsurprisingly the top offenders for extreme weather. But who knew that "extreme sunshine" was a thing?</w:t>
+        <w:t>The Scottish Mountaineering Club keeps an official list of all the Munros in the country and, according to this week’s dataset, there are over 250 of them.</w:t>
       </w:r>
     </w:p>
     <w:p>
@@ -117,55 +90,249 @@
       <w:pPr>
         <w:spacing w:after="0"/>
         <w:rPr>
-          <w:rFonts w:ascii="Aptos" w:hAnsi="Aptos"/>
-        </w:rPr>
-      </w:pPr>
-      <w:bookmarkStart w:id="3" w:name="_Hlk206444803"/>
-      <w:r>
-        <w:rPr>
-          <w:rFonts w:ascii="Aptos" w:hAnsi="Aptos"/>
-        </w:rPr>
-        <w:t>Notebook:</w:t>
+          <w:rFonts w:ascii="Aptos" w:hAnsi="Aptos" w:cs="Apple Color Emoji"/>
+        </w:rPr>
+      </w:pPr>
+      <w:r>
+        <w:rPr>
+          <w:rFonts w:ascii="Aptos" w:hAnsi="Aptos" w:cs="Apple Color Emoji"/>
+        </w:rPr>
+        <w:t xml:space="preserve">Every time I do a mapping visualization, I uncover new layers to the complexities of cartography. This time I learned about the </w:t>
+      </w:r>
+      <w:r>
+        <w:rPr>
+          <w:rFonts w:ascii="Aptos" w:hAnsi="Aptos" w:cs="Apple Color Emoji"/>
+        </w:rPr>
+        <w:t>British National Grid (BNG), where</w:t>
+      </w:r>
+      <w:r>
+        <w:rPr>
+          <w:rFonts w:ascii="Aptos" w:hAnsi="Aptos" w:cs="Apple Color Emoji"/>
+        </w:rPr>
+        <w:t xml:space="preserve"> locations are given in X and Y coordinates </w:t>
+      </w:r>
+      <w:r>
+        <w:rPr>
+          <w:rFonts w:ascii="Aptos" w:hAnsi="Aptos" w:cs="Apple Color Emoji"/>
+        </w:rPr>
+        <w:t>such that</w:t>
+      </w:r>
+      <w:r>
+        <w:rPr>
+          <w:rFonts w:ascii="Aptos" w:hAnsi="Aptos" w:cs="Apple Color Emoji"/>
+        </w:rPr>
+        <w:t>:</w:t>
       </w:r>
     </w:p>
     <w:p>
       <w:pPr>
         <w:spacing w:after="0"/>
-      </w:pPr>
-      <w:hyperlink r:id="rId5" w:history="1">
-        <w:r>
-          <w:rPr>
-            <w:rStyle w:val="Hyperlink"/>
-          </w:rPr>
-          <w:t>https://stevenvillalon.g</w:t>
-        </w:r>
-        <w:r>
-          <w:rPr>
-            <w:rStyle w:val="Hyperlink"/>
-          </w:rPr>
-          <w:t>i</w:t>
-        </w:r>
-        <w:r>
-          <w:rPr>
-            <w:rStyle w:val="Hyperlink"/>
-          </w:rPr>
-          <w:t>thub.io/portfolio/TIDYTUESDAY/2025-08-12-EXTREME.WEATHER/2025-08-12_tidy_tuesday_e</w:t>
-        </w:r>
-        <w:r>
-          <w:rPr>
-            <w:rStyle w:val="Hyperlink"/>
-          </w:rPr>
-          <w:t>x</w:t>
-        </w:r>
-        <w:r>
-          <w:rPr>
-            <w:rStyle w:val="Hyperlink"/>
-          </w:rPr>
-          <w:t>treme_weather_O.html</w:t>
-        </w:r>
-      </w:hyperlink>
+        <w:rPr>
+          <w:rFonts w:ascii="Aptos" w:hAnsi="Aptos" w:cs="Apple Color Emoji"/>
+        </w:rPr>
+      </w:pPr>
+      <w:r>
+        <w:rPr>
+          <w:rFonts w:ascii="Aptos" w:hAnsi="Aptos" w:cs="Apple Color Emoji"/>
+        </w:rPr>
+        <w:t xml:space="preserve">• </w:t>
+      </w:r>
+      <w:r>
+        <w:rPr>
+          <w:rFonts w:ascii="Aptos" w:hAnsi="Aptos" w:cs="Apple Color Emoji"/>
+        </w:rPr>
+        <w:t>X</w:t>
+      </w:r>
+      <w:r>
+        <w:rPr>
+          <w:rFonts w:ascii="Aptos" w:hAnsi="Aptos" w:cs="Apple Color Emoji"/>
+        </w:rPr>
+        <w:t xml:space="preserve"> = </w:t>
+      </w:r>
+      <w:r>
+        <w:rPr>
+          <w:rFonts w:ascii="Aptos" w:hAnsi="Aptos" w:cs="Apple Color Emoji"/>
+        </w:rPr>
+        <w:t>Easting</w:t>
+      </w:r>
+      <w:r>
+        <w:rPr>
+          <w:rFonts w:ascii="Aptos" w:hAnsi="Aptos" w:cs="Apple Color Emoji"/>
+        </w:rPr>
+        <w:t xml:space="preserve"> (</w:t>
+      </w:r>
+      <w:r>
+        <w:rPr>
+          <w:rFonts w:ascii="Aptos" w:hAnsi="Aptos" w:cs="Apple Color Emoji"/>
+        </w:rPr>
+        <w:t>meters east of the grid origin</w:t>
+      </w:r>
+      <w:r>
+        <w:rPr>
+          <w:rFonts w:ascii="Aptos" w:hAnsi="Aptos" w:cs="Apple Color Emoji"/>
+        </w:rPr>
+        <w:t>)</w:t>
+      </w:r>
     </w:p>
-    <w:bookmarkEnd w:id="3"/>
+    <w:p>
+      <w:pPr>
+        <w:spacing w:after="0"/>
+        <w:rPr>
+          <w:rFonts w:ascii="Aptos" w:hAnsi="Aptos" w:cs="Apple Color Emoji"/>
+        </w:rPr>
+      </w:pPr>
+      <w:r>
+        <w:rPr>
+          <w:rFonts w:ascii="Aptos" w:hAnsi="Aptos" w:cs="Apple Color Emoji"/>
+        </w:rPr>
+        <w:t xml:space="preserve">• </w:t>
+      </w:r>
+      <w:r>
+        <w:rPr>
+          <w:rFonts w:ascii="Aptos" w:hAnsi="Aptos" w:cs="Apple Color Emoji"/>
+        </w:rPr>
+        <w:t xml:space="preserve">Y </w:t>
+      </w:r>
+      <w:r>
+        <w:rPr>
+          <w:rFonts w:ascii="Aptos" w:hAnsi="Aptos" w:cs="Apple Color Emoji"/>
+        </w:rPr>
+        <w:t xml:space="preserve">= </w:t>
+      </w:r>
+      <w:r>
+        <w:rPr>
+          <w:rFonts w:ascii="Aptos" w:hAnsi="Aptos" w:cs="Apple Color Emoji"/>
+        </w:rPr>
+        <w:t>Northing</w:t>
+      </w:r>
+      <w:r>
+        <w:rPr>
+          <w:rFonts w:ascii="Aptos" w:hAnsi="Aptos" w:cs="Apple Color Emoji"/>
+        </w:rPr>
+        <w:t xml:space="preserve"> (</w:t>
+      </w:r>
+      <w:r>
+        <w:rPr>
+          <w:rFonts w:ascii="Aptos" w:hAnsi="Aptos" w:cs="Apple Color Emoji"/>
+        </w:rPr>
+        <w:t>meters north of the grid origin</w:t>
+      </w:r>
+      <w:r>
+        <w:rPr>
+          <w:rFonts w:ascii="Aptos" w:hAnsi="Aptos" w:cs="Apple Color Emoji"/>
+        </w:rPr>
+        <w:t>)</w:t>
+      </w:r>
+    </w:p>
+    <w:p>
+      <w:pPr>
+        <w:spacing w:after="0"/>
+        <w:rPr>
+          <w:rFonts w:ascii="Aptos" w:hAnsi="Aptos" w:cs="Apple Color Emoji"/>
+        </w:rPr>
+      </w:pPr>
+    </w:p>
+    <w:p>
+      <w:pPr>
+        <w:spacing w:after="0"/>
+        <w:rPr>
+          <w:rFonts w:ascii="Aptos" w:hAnsi="Aptos" w:cs="Apple Color Emoji"/>
+        </w:rPr>
+      </w:pPr>
+      <w:r>
+        <w:rPr>
+          <w:rFonts w:ascii="Aptos" w:hAnsi="Aptos" w:cs="Apple Color Emoji"/>
+        </w:rPr>
+        <w:t>I converted the BNG coordinates to latitude and longitude and plotted the Munros on a map of Scotland.</w:t>
+      </w:r>
+    </w:p>
+    <w:p>
+      <w:pPr>
+        <w:spacing w:after="0"/>
+        <w:rPr>
+          <w:rFonts w:ascii="Aptos" w:hAnsi="Aptos" w:cs="Apple Color Emoji"/>
+        </w:rPr>
+      </w:pPr>
+    </w:p>
+    <w:p>
+      <w:pPr>
+        <w:spacing w:after="0"/>
+        <w:rPr>
+          <w:rFonts w:ascii="Aptos" w:hAnsi="Aptos" w:cs="Apple Color Emoji"/>
+        </w:rPr>
+      </w:pPr>
+      <w:r>
+        <w:rPr>
+          <w:rFonts w:ascii="Aptos" w:hAnsi="Aptos" w:cs="Apple Color Emoji"/>
+        </w:rPr>
+        <w:t xml:space="preserve">The term </w:t>
+      </w:r>
+      <w:r>
+        <w:rPr>
+          <w:rFonts w:ascii="Aptos" w:hAnsi="Aptos" w:cs="Apple Color Emoji"/>
+        </w:rPr>
+        <w:t>"Munro bagging" is the activity of climbing all the Munros.</w:t>
+      </w:r>
+      <w:r>
+        <w:rPr>
+          <w:rFonts w:ascii="Aptos" w:hAnsi="Aptos" w:cs="Apple Color Emoji"/>
+        </w:rPr>
+        <w:t xml:space="preserve"> Can you imagine how fun it would be to climb all of them!</w:t>
+      </w:r>
+    </w:p>
+    <w:p>
+      <w:pPr>
+        <w:spacing w:after="0"/>
+        <w:rPr>
+          <w:rFonts w:ascii="Aptos" w:hAnsi="Aptos" w:cs="Apple Color Emoji"/>
+        </w:rPr>
+      </w:pPr>
+    </w:p>
+    <w:p>
+      <w:pPr>
+        <w:spacing w:after="0"/>
+        <w:rPr>
+          <w:rFonts w:ascii="Aptos" w:hAnsi="Aptos"/>
+        </w:rPr>
+      </w:pPr>
+      <w:bookmarkStart w:id="4" w:name="_Hlk206444803"/>
+      <w:r>
+        <w:rPr>
+          <w:rFonts w:ascii="Aptos" w:hAnsi="Aptos"/>
+        </w:rPr>
+        <w:t>Notebook:</w:t>
+      </w:r>
+    </w:p>
+    <w:bookmarkEnd w:id="4"/>
+    <w:p>
+      <w:pPr>
+        <w:spacing w:after="0"/>
+      </w:pPr>
+      <w:r>
+        <w:fldChar w:fldCharType="begin"/>
+      </w:r>
+      <w:r>
+        <w:instrText>HYPERLINK "</w:instrText>
+      </w:r>
+      <w:r>
+        <w:instrText>https://stevenvillalon.github.io/portfolio/TIDYTUESDAY/2025-08-19-SCOTTISH.MUNROS/2025-08-19_tidy_tuesday_scottish_munros_O.html</w:instrText>
+      </w:r>
+      <w:r>
+        <w:instrText>"</w:instrText>
+      </w:r>
+      <w:r>
+        <w:fldChar w:fldCharType="separate"/>
+      </w:r>
+      <w:r>
+        <w:rPr>
+          <w:rStyle w:val="Hyperlink"/>
+        </w:rPr>
+        <w:t>https://stevenvillalon.github.io/portfolio/TIDYTUESDAY/2025-08-19-SCOTTISH.MUNROS/2025-08-19_tidy_tuesday_scottish_munros_O.html</w:t>
+      </w:r>
+      <w:r>
+        <w:fldChar w:fldCharType="end"/>
+      </w:r>
+    </w:p>
     <w:p>
       <w:pPr>
         <w:spacing w:after="0"/>
@@ -190,13 +357,7 @@
         </w:rPr>
         <w:t>#PydyTuesday #DataScience #DataViz #PortfolioProject #NDDS #NotreDame #TidyTuesday</w:t>
       </w:r>
-    </w:p>
-    <w:p>
-      <w:pPr>
-        <w:rPr>
-          <w:rFonts w:ascii="Aptos" w:hAnsi="Aptos"/>
-        </w:rPr>
-      </w:pPr>
+      <w:bookmarkEnd w:id="3"/>
     </w:p>
     <w:sectPr>
       <w:pgSz w:w="12240" w:h="15840"/>

</xml_diff>